<commit_message>
Generate AI weekly report
</commit_message>
<xml_diff>
--- a/reports/generated/건설_이라크 주간 종합상황보고(7월 10일).docx
+++ b/reports/generated/건설_이라크 주간 종합상황보고(7월 10일).docx
@@ -130,7 +130,7 @@
           <w:sz w:val="28"/>
           <w:szCs w:val="28"/>
         </w:rPr>
-        <w:t xml:space="preserve">* NIC(NIC) 의장 하이더 마키야에 대한 심문과 면직이 연쇄적으로 진행되며 의회의 감사 기능이 전면에 부각.</w:t>
+        <w:t xml:space="preserve">* NIC(NIC) 의장 하이더 마키야에 대한 심문과 면직이 집중 진행되며, 관련 파일의 부패방지위원회 이관이 병행되는 흐름.</w:t>
       </w:r>
     </w:p>
     <w:p>
@@ -149,26 +149,7 @@
           <w:sz w:val="28"/>
           <w:szCs w:val="28"/>
         </w:rPr>
-        <w:t xml:space="preserve">* 투자·주택 사업 관련 책임 추궁이 병행되면서 행정절차 부담과 승인 지연 가능성 확대.</w:t>
-      </w:r>
-    </w:p>
-    <w:p>
-      <w:pPr>
-        <w:spacing w:after="80" w:before="0" w:line="240"/>
-        <w:ind w:left="1450"/>
-        <w:jc w:val="left"/>
-      </w:pPr>
-      <w:r>
-        <w:rPr>
-          <w:rFonts w:ascii="Batang" w:cs="Batang" w:eastAsia="Batang" w:hAnsi="Batang"/>
-          <w:b w:val="false"/>
-          <w:bCs w:val="false"/>
-          <w:i w:val="false"/>
-          <w:iCs w:val="false"/>
-          <w:sz w:val="28"/>
-          <w:szCs w:val="28"/>
-        </w:rPr>
-        <w:t xml:space="preserve">* 부패 척결 명분 아래 투자관리 체계 재점검이 이어지는 흐름.</w:t>
+        <w:t xml:space="preserve">* 의회가 투자·주택 사업 전반에 대한 감시를 강화하는 가운데, 행정절차 부담과 승인 지연 가능성이 확대되는 양상.</w:t>
       </w:r>
     </w:p>
     <w:p>
@@ -187,7 +168,7 @@
           <w:sz w:val="28"/>
           <w:szCs w:val="28"/>
         </w:rPr>
-        <w:t xml:space="preserve">☞ 투자사업 관리 강화와 함께 의회 견제가 상시화될 가능성으로, 대형 사업 일정과 인허가 대응 부담이 커질 전망.</w:t>
+        <w:t xml:space="preserve">☞ 투자·건설 사업의 신뢰도보다 의회 견제와 행정 재검토 부담이 우선 부각되는 국면으로 해석.</w:t>
       </w:r>
     </w:p>
     <w:p>
@@ -206,7 +187,7 @@
           <w:sz w:val="28"/>
           <w:szCs w:val="28"/>
         </w:rPr>
-        <w:t xml:space="preserve">- 7.9, 조정프레임워크, 부패 척결 지지 및 내부 균열 노출.</w:t>
+        <w:t xml:space="preserve">- 7.9, 조정프레임워크, 부패 척결 지지 및 내부 압박 대응.</w:t>
       </w:r>
     </w:p>
     <w:p>
@@ -225,7 +206,7 @@
           <w:sz w:val="28"/>
           <w:szCs w:val="28"/>
         </w:rPr>
-        <w:t xml:space="preserve">* 부패 척결 지지와 법적 조치 요구가 반복되었으나, 동시에 부패 스캔들 이후 긴급 회의와 내부 갈등 신호가 병행.</w:t>
+        <w:t xml:space="preserve">* 부패 척결과 무기 통제 지지 입장을 반복하며 정부 노선에 대한 정치적 방어를 강화하는 모습.</w:t>
       </w:r>
     </w:p>
     <w:p>
@@ -244,26 +225,7 @@
           <w:sz w:val="28"/>
           <w:szCs w:val="28"/>
         </w:rPr>
-        <w:t xml:space="preserve">* 말리키 관련 발언과 시아파 연합 결속력 논란이 이어지며 조정프레임워크의 방어적 대응이 강화.</w:t>
-      </w:r>
-    </w:p>
-    <w:p>
-      <w:pPr>
-        <w:spacing w:after="80" w:before="0" w:line="240"/>
-        <w:ind w:left="1450"/>
-        <w:jc w:val="left"/>
-      </w:pPr>
-      <w:r>
-        <w:rPr>
-          <w:rFonts w:ascii="Batang" w:cs="Batang" w:eastAsia="Batang" w:hAnsi="Batang"/>
-          <w:b w:val="false"/>
-          <w:bCs w:val="false"/>
-          <w:i w:val="false"/>
-          <w:iCs w:val="false"/>
-          <w:sz w:val="28"/>
-          <w:szCs w:val="28"/>
-        </w:rPr>
-        <w:t xml:space="preserve">* 부패 대응을 둘러싼 정치적 압박과 연합 내 조율 부담이 동시 확대.</w:t>
+        <w:t xml:space="preserve">* 동시에 부패 스캔들 이후 내부 결속 약화와 정치적 저항이 병존하며, 연합 내 조정 필요성이 커지는 흐름.</w:t>
       </w:r>
     </w:p>
     <w:p>
@@ -282,7 +244,7 @@
           <w:sz w:val="28"/>
           <w:szCs w:val="28"/>
         </w:rPr>
-        <w:t xml:space="preserve">☞ 개혁 명분은 유지되나, 실제 정책 집행은 연합 내 이해관계 조정에 따라 지연될 가능성.</w:t>
+        <w:t xml:space="preserve">☞ 개혁 지지와 방어 논리가 병행되나, 실제 정책 집행은 정치권 내 이견으로 지연될 가능성.</w:t>
       </w:r>
     </w:p>
     <w:p>
@@ -301,7 +263,7 @@
           <w:sz w:val="28"/>
           <w:szCs w:val="28"/>
         </w:rPr>
-        <w:t xml:space="preserve">- 7.7, 알수다니 측, 재건·부패척결 프레임 재강조.</w:t>
+        <w:t xml:space="preserve">- 7.7, 알수다니 측, 재건발전 연합 방어 및 부패 대응 강조.</w:t>
       </w:r>
     </w:p>
     <w:p>
@@ -320,7 +282,7 @@
           <w:sz w:val="28"/>
           <w:szCs w:val="28"/>
         </w:rPr>
-        <w:t xml:space="preserve">* 재건발전 동맹이 부패 척결과 무기 통제 지지를 재확인하며 정부 노선에 대한 정치적 방어를 지속.</w:t>
+        <w:t xml:space="preserve">* 재건발전 연합이 부패 척결과 국가 무기 집중화 지지를 재확인하며 정부 노선과의 연계를 유지하는 모습.</w:t>
       </w:r>
     </w:p>
     <w:p>
@@ -339,26 +301,7 @@
           <w:sz w:val="28"/>
           <w:szCs w:val="28"/>
         </w:rPr>
-        <w:t xml:space="preserve">* 동시에 알수다니와 재건발전 연계 의혹, 지원 자금 논란이 제기되며 정치적 공방이 확대.</w:t>
-      </w:r>
-    </w:p>
-    <w:p>
-      <w:pPr>
-        <w:spacing w:after="80" w:before="0" w:line="240"/>
-        <w:ind w:left="1450"/>
-        <w:jc w:val="left"/>
-      </w:pPr>
-      <w:r>
-        <w:rPr>
-          <w:rFonts w:ascii="Batang" w:cs="Batang" w:eastAsia="Batang" w:hAnsi="Batang"/>
-          <w:b w:val="false"/>
-          <w:bCs w:val="false"/>
-          <w:i w:val="false"/>
-          <w:iCs w:val="false"/>
-          <w:sz w:val="28"/>
-          <w:szCs w:val="28"/>
-        </w:rPr>
-        <w:t xml:space="preserve">* 정부·재건발전 진영이 개혁과 안정 메시지를 유지하나, 반대 진영의 압박도 병존.</w:t>
+        <w:t xml:space="preserve">* 반면 상대 진영에서는 재건발전과 알수다니 측의 연계 및 자금 출처를 둘러싼 공세가 이어져 정치적 공방이 심화되는 양상.</w:t>
       </w:r>
     </w:p>
     <w:p>
@@ -377,7 +320,7 @@
           <w:sz w:val="28"/>
           <w:szCs w:val="28"/>
         </w:rPr>
-        <w:t xml:space="preserve">☞ 총리 측은 개혁·안정 프레임을 유지하겠으나, 정치 공방이 투자·건설 행정에 간접 부담으로 작용할 가능성.</w:t>
+        <w:t xml:space="preserve">☞ 총리 측은 개혁·치안 프레임으로 방어하나, 정치 공방이 투자사업 관리와 대외 협의에 부담으로 작용.</w:t>
       </w:r>
     </w:p>
     <w:p>
@@ -396,7 +339,7 @@
           <w:sz w:val="28"/>
           <w:szCs w:val="28"/>
         </w:rPr>
-        <w:t xml:space="preserve">- 7.7, 사드르계, 부패척결 지지 시위 확산.</w:t>
+        <w:t xml:space="preserve">- 7.6, 법치국가연합·말리키, 부패 척결 명분 강화.</w:t>
       </w:r>
     </w:p>
     <w:p>
@@ -415,7 +358,7 @@
           <w:sz w:val="28"/>
           <w:szCs w:val="28"/>
         </w:rPr>
-        <w:t xml:space="preserve">* 바그다드와 나사리야 등지에서 사드르계 지지층이 정부의 부패 척결 행보를 지지하는 시위 전개.</w:t>
+        <w:t xml:space="preserve">* 말리키가 부패 방지를 국가 최우선 과제로 제시하며 권력기관 협력을 촉구하는 등 정국 주도권 확보 시도.</w:t>
       </w:r>
     </w:p>
     <w:p>
@@ -434,26 +377,7 @@
           <w:sz w:val="28"/>
           <w:szCs w:val="28"/>
         </w:rPr>
-        <w:t xml:space="preserve">* 부패 문제에 대한 시민 반발과 정치적 압박이 동반되며, 의회·정부 모두 강경 대응을 의식하는 분위기.</w:t>
-      </w:r>
-    </w:p>
-    <w:p>
-      <w:pPr>
-        <w:spacing w:after="80" w:before="0" w:line="240"/>
-        <w:ind w:left="1450"/>
-        <w:jc w:val="left"/>
-      </w:pPr>
-      <w:r>
-        <w:rPr>
-          <w:rFonts w:ascii="Batang" w:cs="Batang" w:eastAsia="Batang" w:hAnsi="Batang"/>
-          <w:b w:val="false"/>
-          <w:bCs w:val="false"/>
-          <w:i w:val="false"/>
-          <w:iCs w:val="false"/>
-          <w:sz w:val="28"/>
-          <w:szCs w:val="28"/>
-        </w:rPr>
-        <w:t xml:space="preserve">* 사드르계는 개혁 명분을 활용해 정치적 영향력 확대를 시도하는 흐름.</w:t>
+        <w:t xml:space="preserve">* 조정프레임워크와 연계된 세력 전반이 부패 단속을 지지하면서도, 실행 방식과 정치적 타협 가능성을 둘러싼 경계가 병존.</w:t>
       </w:r>
     </w:p>
     <w:p>
@@ -472,7 +396,7 @@
           <w:sz w:val="28"/>
           <w:szCs w:val="28"/>
         </w:rPr>
-        <w:t xml:space="preserve">☞ 거리 여론이 부패 척결을 압박하는 방향으로 작용해, 정치권 전반의 긴장도가 높아질 전망.</w:t>
+        <w:t xml:space="preserve">☞ 부패 척결이 공통 의제로 부상했으나, 실제로는 정치적 압박 수단으로 활용될 가능성.</w:t>
       </w:r>
     </w:p>
     <w:p>
@@ -491,7 +415,7 @@
           <w:sz w:val="28"/>
           <w:szCs w:val="28"/>
         </w:rPr>
-        <w:t xml:space="preserve">- 7.6, 수니 정치권, 부패 문제 제기 및 견제 강화.</w:t>
+        <w:t xml:space="preserve">- 7.7, 사드르계, 부패 척결 지지 시위 확산.</w:t>
       </w:r>
     </w:p>
     <w:p>
@@ -510,7 +434,7 @@
           <w:sz w:val="28"/>
           <w:szCs w:val="28"/>
         </w:rPr>
-        <w:t xml:space="preserve">* 수니 정치권이 대형 프로젝트와 부패 연계를 문제 삼으며 의회 내 감시 강화 요구를 확대.</w:t>
+        <w:t xml:space="preserve">* 바그다드와 나사리야 등지에서 사드르계 지지층이 정부의 부패 척결 행보를 지지하는 집회를 전개.</w:t>
       </w:r>
     </w:p>
     <w:p>
@@ -529,26 +453,7 @@
           <w:sz w:val="28"/>
           <w:szCs w:val="28"/>
         </w:rPr>
-        <w:t xml:space="preserve">* 하르부시 측의 책임자 면직 권고 등으로 수니 진영도 부패 이슈를 활용한 압박에 나서는 양상.</w:t>
-      </w:r>
-    </w:p>
-    <w:p>
-      <w:pPr>
-        <w:spacing w:after="80" w:before="0" w:line="240"/>
-        <w:ind w:left="1450"/>
-        <w:jc w:val="left"/>
-      </w:pPr>
-      <w:r>
-        <w:rPr>
-          <w:rFonts w:ascii="Batang" w:cs="Batang" w:eastAsia="Batang" w:hAnsi="Batang"/>
-          <w:b w:val="false"/>
-          <w:bCs w:val="false"/>
-          <w:i w:val="false"/>
-          <w:iCs w:val="false"/>
-          <w:sz w:val="28"/>
-          <w:szCs w:val="28"/>
-        </w:rPr>
-        <w:t xml:space="preserve">* 의회 내 감시·견제 강화가 투자·주택 사업 전반의 심사 강도를 높일 가능성.</w:t>
+        <w:t xml:space="preserve">* 부패 문제를 둘러싼 시민 반발과 정치적 동원이 함께 나타나며, 거리 정치가 의회 압박 수단으로 재부상하는 흐름.</w:t>
       </w:r>
     </w:p>
     <w:p>
@@ -567,102 +472,7 @@
           <w:sz w:val="28"/>
           <w:szCs w:val="28"/>
         </w:rPr>
-        <w:t xml:space="preserve">☞ 수니 진영의 견제 강화로 주요 사업의 정치적 검증 절차가 길어질 가능성.</w:t>
-      </w:r>
-    </w:p>
-    <w:p>
-      <w:pPr>
-        <w:spacing w:after="90" w:before="0" w:line="240"/>
-        <w:ind w:left="1276"/>
-        <w:jc w:val="left"/>
-      </w:pPr>
-      <w:r>
-        <w:rPr>
-          <w:rFonts w:ascii="Batang" w:cs="Batang" w:eastAsia="Batang" w:hAnsi="Batang"/>
-          <w:b w:val="false"/>
-          <w:bCs w:val="false"/>
-          <w:i w:val="false"/>
-          <w:iCs w:val="false"/>
-          <w:sz w:val="28"/>
-          <w:szCs w:val="28"/>
-        </w:rPr>
-        <w:t xml:space="preserve">- 7.8, 쿠르드 정치권, 내부 갈등 및 연합 재편 압박.</w:t>
-      </w:r>
-    </w:p>
-    <w:p>
-      <w:pPr>
-        <w:spacing w:after="80" w:before="0" w:line="240"/>
-        <w:ind w:left="1450"/>
-        <w:jc w:val="left"/>
-      </w:pPr>
-      <w:r>
-        <w:rPr>
-          <w:rFonts w:ascii="Batang" w:cs="Batang" w:eastAsia="Batang" w:hAnsi="Batang"/>
-          <w:b w:val="false"/>
-          <w:bCs w:val="false"/>
-          <w:i w:val="false"/>
-          <w:iCs w:val="false"/>
-          <w:sz w:val="28"/>
-          <w:szCs w:val="28"/>
-        </w:rPr>
-        <w:t xml:space="preserve">* 쿠르드 자치정부 구성 위기와 바르자니 가문 내부 갈등 가능성이 제기되며 지역 정치 불안정성 확대.</w:t>
-      </w:r>
-    </w:p>
-    <w:p>
-      <w:pPr>
-        <w:spacing w:after="80" w:before="0" w:line="240"/>
-        <w:ind w:left="1450"/>
-        <w:jc w:val="left"/>
-      </w:pPr>
-      <w:r>
-        <w:rPr>
-          <w:rFonts w:ascii="Batang" w:cs="Batang" w:eastAsia="Batang" w:hAnsi="Batang"/>
-          <w:b w:val="false"/>
-          <w:bCs w:val="false"/>
-          <w:i w:val="false"/>
-          <w:iCs w:val="false"/>
-          <w:sz w:val="28"/>
-          <w:szCs w:val="28"/>
-        </w:rPr>
-        <w:t xml:space="preserve">* 새로운 연합 요구 거부와 재선거 가능성 논의가 병행되며 권력 분배 갈등이 지속.</w:t>
-      </w:r>
-    </w:p>
-    <w:p>
-      <w:pPr>
-        <w:spacing w:after="80" w:before="0" w:line="240"/>
-        <w:ind w:left="1450"/>
-        <w:jc w:val="left"/>
-      </w:pPr>
-      <w:r>
-        <w:rPr>
-          <w:rFonts w:ascii="Batang" w:cs="Batang" w:eastAsia="Batang" w:hAnsi="Batang"/>
-          <w:b w:val="false"/>
-          <w:bCs w:val="false"/>
-          <w:i w:val="false"/>
-          <w:iCs w:val="false"/>
-          <w:sz w:val="28"/>
-          <w:szCs w:val="28"/>
-        </w:rPr>
-        <w:t xml:space="preserve">* 쿠르드 진영도 부패 척결 캠페인에는 동조하나, 내부 권력 재편 부담이 큰 상황.</w:t>
-      </w:r>
-    </w:p>
-    <w:p>
-      <w:pPr>
-        <w:spacing w:after="140" w:before="0" w:line="240"/>
-        <w:ind w:left="1450"/>
-        <w:jc w:val="left"/>
-      </w:pPr>
-      <w:r>
-        <w:rPr>
-          <w:rFonts w:ascii="Batang" w:cs="Batang" w:eastAsia="Batang" w:hAnsi="Batang"/>
-          <w:b w:val="false"/>
-          <w:bCs w:val="false"/>
-          <w:i w:val="false"/>
-          <w:iCs w:val="false"/>
-          <w:sz w:val="28"/>
-          <w:szCs w:val="28"/>
-        </w:rPr>
-        <w:t xml:space="preserve">☞ 북부 정치 불안이 연방 차원의 협상 지연으로 이어질 수 있어, 대외 협의 일정 관리가 필요.</w:t>
+        <w:t xml:space="preserve">☞ 대중 동원이 부패 이슈를 증폭시키며, 향후 정치권의 추가 조치 요구로 이어질 가능성.</w:t>
       </w:r>
     </w:p>
     <w:p>
@@ -1201,7 +1011,7 @@
           <w:sz w:val="28"/>
           <w:szCs w:val="28"/>
         </w:rPr>
-        <w:t xml:space="preserve">- 7.9, 바그다드, 외부 업무·이동 경호 리스크 지속.</w:t>
+        <w:t xml:space="preserve">- 7.4, 바그다드·비스마야, 안전사고 및 경계 필요 확대.</w:t>
       </w:r>
     </w:p>
     <w:p>
@@ -1220,7 +1030,7 @@
           <w:sz w:val="28"/>
           <w:szCs w:val="28"/>
         </w:rPr>
-        <w:t xml:space="preserve">* 이번 주 치안 기사에서 대규모 테러 사건은 확인되지 않았으나, 바그다드와 인근 지역의 납치·위협 우려가 반복.</w:t>
+        <w:t xml:space="preserve">* 비스마야 주거단지에서 추락 사망 사건이 발생해 지역 안전관리 점검 필요성이 부각.</w:t>
       </w:r>
     </w:p>
     <w:p>
@@ -1239,26 +1049,7 @@
           <w:sz w:val="28"/>
           <w:szCs w:val="28"/>
         </w:rPr>
-        <w:t xml:space="preserve">* IS 재확산 경고와 외국인 안전 관련 경계가 지속되며, 현장 외부 업무 시 사전 위협 분석 필요성 유지.</w:t>
-      </w:r>
-    </w:p>
-    <w:p>
-      <w:pPr>
-        <w:spacing w:after="80" w:before="0" w:line="240"/>
-        <w:ind w:left="1450"/>
-        <w:jc w:val="left"/>
-      </w:pPr>
-      <w:r>
-        <w:rPr>
-          <w:rFonts w:ascii="Batang" w:cs="Batang" w:eastAsia="Batang" w:hAnsi="Batang"/>
-          <w:b w:val="false"/>
-          <w:bCs w:val="false"/>
-          <w:i w:val="false"/>
-          <w:iCs w:val="false"/>
-          <w:sz w:val="28"/>
-          <w:szCs w:val="28"/>
-        </w:rPr>
-        <w:t xml:space="preserve">* 정치 시위가 바그다드 중심으로 이어져 군중 밀집 지역 접근 시 주의 필요.</w:t>
+        <w:t xml:space="preserve">* 바그다드 및 인근 지역에서 외부 업무·이동 시 안전수칙 준수와 현장 경계 강화 필요성이 지속.</w:t>
       </w:r>
     </w:p>
     <w:p>
@@ -1277,7 +1068,7 @@
           <w:sz w:val="28"/>
           <w:szCs w:val="28"/>
         </w:rPr>
-        <w:t xml:space="preserve">☞ 바그다드 내 이동경호와 외부 일정 통제가 계속 요구되는 상황.</w:t>
+        <w:t xml:space="preserve">☞ 현장 및 주거단지 주변의 일상적 안전사고도 외부 업무 리스크로 관리 필요.</w:t>
       </w:r>
     </w:p>
     <w:p>
@@ -1296,7 +1087,7 @@
           <w:sz w:val="28"/>
           <w:szCs w:val="28"/>
         </w:rPr>
-        <w:t xml:space="preserve">- 7.7, IS 및 시리아 연계 리스크, 국경 경계 강화.</w:t>
+        <w:t xml:space="preserve">- 7.3, 이라크 내, 테러·치안 위협 상시화.</w:t>
       </w:r>
     </w:p>
     <w:p>
@@ -1315,7 +1106,7 @@
           <w:sz w:val="28"/>
           <w:szCs w:val="28"/>
         </w:rPr>
-        <w:t xml:space="preserve">* 시리아 내 IS 관련 불안과 수감자 탈출 우려가 이라크 내 경계 강화로 연결.</w:t>
+        <w:t xml:space="preserve">* 최근 주간 기사상 IS 관련 직접 사건은 제한적이나, 바그다드 납치·외국인 안전 우려와 연계된 경계 신호가 지속.</w:t>
       </w:r>
     </w:p>
     <w:p>
@@ -1334,26 +1125,7 @@
           <w:sz w:val="28"/>
           <w:szCs w:val="28"/>
         </w:rPr>
-        <w:t xml:space="preserve">* 국경 인근 의심 대상에 대한 즉각 대응 지시와 대테러 대비태세 유지가 병행.</w:t>
-      </w:r>
-    </w:p>
-    <w:p>
-      <w:pPr>
-        <w:spacing w:after="80" w:before="0" w:line="240"/>
-        <w:ind w:left="1450"/>
-        <w:jc w:val="left"/>
-      </w:pPr>
-      <w:r>
-        <w:rPr>
-          <w:rFonts w:ascii="Batang" w:cs="Batang" w:eastAsia="Batang" w:hAnsi="Batang"/>
-          <w:b w:val="false"/>
-          <w:bCs w:val="false"/>
-          <w:i w:val="false"/>
-          <w:iCs w:val="false"/>
-          <w:sz w:val="28"/>
-          <w:szCs w:val="28"/>
-        </w:rPr>
-        <w:t xml:space="preserve">* 이라크 내 IS 잔존세력 및 단독 테러 가능성에 대한 경고가 지속.</w:t>
+        <w:t xml:space="preserve">* PMF 및 친이란 세력의 정치적 동원과 맞물려 시위·집회가 치안 부담으로 전환될 가능성.</w:t>
       </w:r>
     </w:p>
     <w:p>
@@ -1372,7 +1144,45 @@
           <w:sz w:val="28"/>
           <w:szCs w:val="28"/>
         </w:rPr>
-        <w:t xml:space="preserve">☞ 현장 인근 및 국경 연계 리스크를 반영한 출입·이동 통제 필요.</w:t>
+        <w:t xml:space="preserve">☞ 테러보다도 납치·시위·도심 경계 리스크를 중심으로 현장 안전관리 필요.</w:t>
+      </w:r>
+    </w:p>
+    <w:p>
+      <w:pPr>
+        <w:spacing w:after="140" w:before="220" w:line="276"/>
+        <w:ind w:left="567"/>
+        <w:jc w:val="left"/>
+      </w:pPr>
+      <w:r>
+        <w:rPr>
+          <w:rFonts w:ascii="Batang" w:cs="Batang" w:eastAsia="Batang" w:hAnsi="Batang"/>
+          <w:b/>
+          <w:bCs/>
+          <w:i w:val="false"/>
+          <w:iCs w:val="false"/>
+          <w:sz w:val="28"/>
+          <w:szCs w:val="28"/>
+        </w:rPr>
+        <w:t xml:space="preserve">2) 경제</w:t>
+      </w:r>
+    </w:p>
+    <w:p>
+      <w:pPr>
+        <w:spacing w:after="120" w:before="160" w:line="276"/>
+        <w:ind w:left="792"/>
+        <w:jc w:val="left"/>
+      </w:pPr>
+      <w:r>
+        <w:rPr>
+          <w:rFonts w:ascii="Batang" w:cs="Batang" w:eastAsia="Batang" w:hAnsi="Batang"/>
+          <w:b/>
+          <w:bCs/>
+          <w:i w:val="false"/>
+          <w:iCs w:val="false"/>
+          <w:sz w:val="28"/>
+          <w:szCs w:val="28"/>
+        </w:rPr>
+        <w:t xml:space="preserve">· 국제유가 관련 동향</w:t>
       </w:r>
     </w:p>
     <w:p>
@@ -1391,7 +1201,7 @@
           <w:sz w:val="28"/>
           <w:szCs w:val="28"/>
         </w:rPr>
-        <w:t xml:space="preserve">- 7.4, 비스마야, 안전사고 및 현장 리스크 노출.</w:t>
+        <w:t xml:space="preserve">- 7.9, 이라크 의회, 투자위원회 해임으로 투자 관리 재편.</w:t>
       </w:r>
     </w:p>
     <w:p>
@@ -1410,7 +1220,7 @@
           <w:sz w:val="28"/>
           <w:szCs w:val="28"/>
         </w:rPr>
-        <w:t xml:space="preserve">* 비스마야 아파트 단지에서 추락 사망 사건이 발생해 지역 안전 관리 이슈가 부각.</w:t>
+        <w:t xml:space="preserve">* NIC 수장 교체와 심문이 반복되며 투자사업 관리 체계 전반의 재점검이 진행되는 양상.</w:t>
       </w:r>
     </w:p>
     <w:p>
@@ -1429,7 +1239,7 @@
           <w:sz w:val="28"/>
           <w:szCs w:val="28"/>
         </w:rPr>
-        <w:t xml:space="preserve">* 주택단지 관련 사업이 확대되는 가운데, 현장 안전관리와 출입통제 점검 필요성 증가.</w:t>
+        <w:t xml:space="preserve">* 주택·인프라 사업은 확대 기조가 유지되나, 승인 절차와 책임 소재를 둘러싼 행정 부담이 커지는 흐름.</w:t>
       </w:r>
     </w:p>
     <w:p>
@@ -1448,45 +1258,7 @@
           <w:sz w:val="28"/>
           <w:szCs w:val="28"/>
         </w:rPr>
-        <w:t xml:space="preserve">☞ 주거·건설 복합현장에서는 안전관리 기준과 현장 점검을 강화할 필요.</w:t>
-      </w:r>
-    </w:p>
-    <w:p>
-      <w:pPr>
-        <w:spacing w:after="140" w:before="220" w:line="276"/>
-        <w:ind w:left="567"/>
-        <w:jc w:val="left"/>
-      </w:pPr>
-      <w:r>
-        <w:rPr>
-          <w:rFonts w:ascii="Batang" w:cs="Batang" w:eastAsia="Batang" w:hAnsi="Batang"/>
-          <w:b/>
-          <w:bCs/>
-          <w:i w:val="false"/>
-          <w:iCs w:val="false"/>
-          <w:sz w:val="28"/>
-          <w:szCs w:val="28"/>
-        </w:rPr>
-        <w:t xml:space="preserve">2) 경제</w:t>
-      </w:r>
-    </w:p>
-    <w:p>
-      <w:pPr>
-        <w:spacing w:after="120" w:before="160" w:line="276"/>
-        <w:ind w:left="792"/>
-        <w:jc w:val="left"/>
-      </w:pPr>
-      <w:r>
-        <w:rPr>
-          <w:rFonts w:ascii="Batang" w:cs="Batang" w:eastAsia="Batang" w:hAnsi="Batang"/>
-          <w:b/>
-          <w:bCs/>
-          <w:i w:val="false"/>
-          <w:iCs w:val="false"/>
-          <w:sz w:val="28"/>
-          <w:szCs w:val="28"/>
-        </w:rPr>
-        <w:t xml:space="preserve">· 국제유가 관련 동향</w:t>
+        <w:t xml:space="preserve">☞ 사업 확대 기대보다 투자 승인 지연과 행정 재검토 리스크를 우선 고려 필요.</w:t>
       </w:r>
     </w:p>
     <w:p>
@@ -1505,7 +1277,7 @@
           <w:sz w:val="28"/>
           <w:szCs w:val="28"/>
         </w:rPr>
-        <w:t xml:space="preserve">- 7.9, 이라크 의회, 투자위원회 해임으로 투자행정 재점검.</w:t>
+        <w:t xml:space="preserve">- 7.9, 이라크 정부, 국가 주택 전략 및 토지 분배 추진.</w:t>
       </w:r>
     </w:p>
     <w:p>
@@ -1524,7 +1296,7 @@
           <w:sz w:val="28"/>
           <w:szCs w:val="28"/>
         </w:rPr>
-        <w:t xml:space="preserve">* NIC 의장 해임과 부패 조사 착수가 투자·주택 사업의 행정 절차를 재정비하는 방향으로 전개.</w:t>
+        <w:t xml:space="preserve">* 주택난 해소를 위한 국가 주택 전략과 100만 필지 분배 계획이 병행되며 주택정책 드라이브가 강화.</w:t>
       </w:r>
     </w:p>
     <w:p>
@@ -1543,26 +1315,7 @@
           <w:sz w:val="28"/>
           <w:szCs w:val="28"/>
         </w:rPr>
-        <w:t xml:space="preserve">* 투자 환경 개선 명분은 있으나, 실제로는 승인 지연과 책임소재 재검토가 동반될 가능성.</w:t>
-      </w:r>
-    </w:p>
-    <w:p>
-      <w:pPr>
-        <w:spacing w:after="80" w:before="0" w:line="240"/>
-        <w:ind w:left="1450"/>
-        <w:jc w:val="left"/>
-      </w:pPr>
-      <w:r>
-        <w:rPr>
-          <w:rFonts w:ascii="Batang" w:cs="Batang" w:eastAsia="Batang" w:hAnsi="Batang"/>
-          <w:b w:val="false"/>
-          <w:bCs w:val="false"/>
-          <w:i w:val="false"/>
-          <w:iCs w:val="false"/>
-          <w:sz w:val="28"/>
-          <w:szCs w:val="28"/>
-        </w:rPr>
-        <w:t xml:space="preserve">* 정부·의회 간 감시 강화가 사업 추진 속도에 부담으로 작용.</w:t>
+        <w:t xml:space="preserve">* 다만 실제 집행은 재원·행정 절차와 연동되어 있어 단기적 사업 속도는 제한될 가능성.</w:t>
       </w:r>
     </w:p>
     <w:p>
@@ -1581,7 +1334,7 @@
           <w:sz w:val="28"/>
           <w:szCs w:val="28"/>
         </w:rPr>
-        <w:t xml:space="preserve">☞ 투자사업 관련 의사결정이 느려질 수 있어, 인허가·대관 일정 관리가 중요.</w:t>
+        <w:t xml:space="preserve">☞ 주택·건설 수요는 유지되나, 실행 속도는 정부 집행력에 좌우될 전망.</w:t>
       </w:r>
     </w:p>
     <w:p>
@@ -1600,7 +1353,7 @@
           <w:sz w:val="28"/>
           <w:szCs w:val="28"/>
         </w:rPr>
-        <w:t xml:space="preserve">- 7.7, 이라크 정부, 주택정책 및 도시개발 확대.</w:t>
+        <w:t xml:space="preserve">- 7.7, COM, 석유·재건주택부 활동 지속.</w:t>
       </w:r>
     </w:p>
     <w:p>
@@ -1619,7 +1372,7 @@
           <w:sz w:val="28"/>
           <w:szCs w:val="28"/>
         </w:rPr>
-        <w:t xml:space="preserve">* 국가 주택 전략, 100만 필지 분배 계획, 신규 도시 개발 논의가 병행되며 주택 공급 확대 기조 유지.</w:t>
+        <w:t xml:space="preserve">* 석유부는 유전·가스 개발 협력 가능성을 검토하고, 재건주택부는 인력양성 및 공공건물·인프라 강화 기조를 유지.</w:t>
       </w:r>
     </w:p>
     <w:p>
@@ -1638,26 +1391,7 @@
           <w:sz w:val="28"/>
           <w:szCs w:val="28"/>
         </w:rPr>
-        <w:t xml:space="preserve">* 알포 연결도로 준공 보도와 함께 인프라 사업 성과 홍보가 이어짐.</w:t>
-      </w:r>
-    </w:p>
-    <w:p>
-      <w:pPr>
-        <w:spacing w:after="80" w:before="0" w:line="240"/>
-        <w:ind w:left="1450"/>
-        <w:jc w:val="left"/>
-      </w:pPr>
-      <w:r>
-        <w:rPr>
-          <w:rFonts w:ascii="Batang" w:cs="Batang" w:eastAsia="Batang" w:hAnsi="Batang"/>
-          <w:b w:val="false"/>
-          <w:bCs w:val="false"/>
-          <w:i w:val="false"/>
-          <w:iCs w:val="false"/>
-          <w:sz w:val="28"/>
-          <w:szCs w:val="28"/>
-        </w:rPr>
-        <w:t xml:space="preserve">* 다만 주택·투자 관련 기관에 대한 의회 감시가 강화돼 실행 단계의 행정 부담은 상존.</w:t>
+        <w:t xml:space="preserve">* 정부 차원의 사업 추진 의지는 확인되나, 정치권 감시 강화로 예산 집행과 계약 관리가 더 엄격해질 가능성.</w:t>
       </w:r>
     </w:p>
     <w:p>
@@ -1676,83 +1410,7 @@
           <w:sz w:val="28"/>
           <w:szCs w:val="28"/>
         </w:rPr>
-        <w:t xml:space="preserve">☞ 주택·인프라 수요는 유지되나, 사업 집행은 정치·행정 리스크를 함께 고려할 필요.</w:t>
-      </w:r>
-    </w:p>
-    <w:p>
-      <w:pPr>
-        <w:spacing w:after="90" w:before="0" w:line="240"/>
-        <w:ind w:left="1276"/>
-        <w:jc w:val="left"/>
-      </w:pPr>
-      <w:r>
-        <w:rPr>
-          <w:rFonts w:ascii="Batang" w:cs="Batang" w:eastAsia="Batang" w:hAnsi="Batang"/>
-          <w:b w:val="false"/>
-          <w:bCs w:val="false"/>
-          <w:i w:val="false"/>
-          <w:iCs w:val="false"/>
-          <w:sz w:val="28"/>
-          <w:szCs w:val="28"/>
-        </w:rPr>
-        <w:t xml:space="preserve">- 7.7, 국제유가, 중동 정세 연동 변동성 지속.</w:t>
-      </w:r>
-    </w:p>
-    <w:p>
-      <w:pPr>
-        <w:spacing w:after="80" w:before="0" w:line="240"/>
-        <w:ind w:left="1450"/>
-        <w:jc w:val="left"/>
-      </w:pPr>
-      <w:r>
-        <w:rPr>
-          <w:rFonts w:ascii="Batang" w:cs="Batang" w:eastAsia="Batang" w:hAnsi="Batang"/>
-          <w:b w:val="false"/>
-          <w:bCs w:val="false"/>
-          <w:i w:val="false"/>
-          <w:iCs w:val="false"/>
-          <w:sz w:val="28"/>
-          <w:szCs w:val="28"/>
-        </w:rPr>
-        <w:t xml:space="preserve">* 유가 관련 구체 수치는 확인되지 않았으며, 중동 긴장과 공급 우려가 가격 변동 요인으로 작용.</w:t>
-      </w:r>
-    </w:p>
-    <w:p>
-      <w:pPr>
-        <w:spacing w:after="80" w:before="0" w:line="240"/>
-        <w:ind w:left="1450"/>
-        <w:jc w:val="left"/>
-      </w:pPr>
-      <w:r>
-        <w:rPr>
-          <w:rFonts w:ascii="Batang" w:cs="Batang" w:eastAsia="Batang" w:hAnsi="Batang"/>
-          <w:b w:val="false"/>
-          <w:bCs w:val="false"/>
-          <w:i w:val="false"/>
-          <w:iCs w:val="false"/>
-          <w:sz w:val="28"/>
-          <w:szCs w:val="28"/>
-        </w:rPr>
-        <w:t xml:space="preserve">* 이라크 재정과 에너지 정책은 유가 흐름 및 지역 정세에 민감하게 연동될 가능성.</w:t>
-      </w:r>
-    </w:p>
-    <w:p>
-      <w:pPr>
-        <w:spacing w:after="140" w:before="0" w:line="240"/>
-        <w:ind w:left="1450"/>
-        <w:jc w:val="left"/>
-      </w:pPr>
-      <w:r>
-        <w:rPr>
-          <w:rFonts w:ascii="Batang" w:cs="Batang" w:eastAsia="Batang" w:hAnsi="Batang"/>
-          <w:b w:val="false"/>
-          <w:bCs w:val="false"/>
-          <w:i w:val="false"/>
-          <w:iCs w:val="false"/>
-          <w:sz w:val="28"/>
-          <w:szCs w:val="28"/>
-        </w:rPr>
-        <w:t xml:space="preserve">☞ 유가 변동성에 따른 예산·대금 집행 리스크 점검 필요.</w:t>
+        <w:t xml:space="preserve">☞ 공공사업 발주는 이어질 수 있으나, 계약·정산·감사 대응 부담이 확대될 수 있음.</w:t>
       </w:r>
     </w:p>
     <w:tbl>
@@ -1916,7 +1574,7 @@
                 <w:sz w:val="22"/>
                 <w:szCs w:val="22"/>
               </w:rPr>
-              <w:t xml:space="preserve">7.3</w:t>
+              <w:t xml:space="preserve">7.9</w:t>
             </w:r>
           </w:p>
         </w:tc>
@@ -2030,7 +1688,7 @@
                 <w:sz w:val="22"/>
                 <w:szCs w:val="22"/>
               </w:rPr>
-              <w:t xml:space="preserve">7.4</w:t>
+              <w:t xml:space="preserve">7.8</w:t>
             </w:r>
           </w:p>
         </w:tc>
@@ -2144,7 +1802,7 @@
                 <w:sz w:val="22"/>
                 <w:szCs w:val="22"/>
               </w:rPr>
-              <w:t xml:space="preserve">7.5</w:t>
+              <w:t xml:space="preserve">7.7</w:t>
             </w:r>
           </w:p>
         </w:tc>
@@ -2324,7 +1982,7 @@
           <w:sz w:val="28"/>
           <w:szCs w:val="28"/>
         </w:rPr>
-        <w:t xml:space="preserve">* 이란 관련 정세는 미국의 압박과 군사 옵션 검토, 중동 전략자산 재배치 등 긴장 요인이 지속.</w:t>
+        <w:t xml:space="preserve">* 이란은 대외 군사 압박과 내부 불안정에 대응해 비상 체제를 유지하는 흐름.</w:t>
       </w:r>
     </w:p>
     <w:p>
@@ -2343,7 +2001,7 @@
           <w:sz w:val="28"/>
           <w:szCs w:val="28"/>
         </w:rPr>
-        <w:t xml:space="preserve">* 이라크 내 친이란 세력은 대외 위협 대응과 무장세력 정비 필요성을 강조하는 흐름.</w:t>
+        <w:t xml:space="preserve">* 이라크 내 친이란 세력은 이란 방어와 미국·이스라엘 위협 대응을 강조하며 연계성을 부각.</w:t>
       </w:r>
     </w:p>
     <w:p>
@@ -2362,7 +2020,7 @@
           <w:sz w:val="28"/>
           <w:szCs w:val="28"/>
         </w:rPr>
-        <w:t xml:space="preserve">☞ 이란 변수는 이라크 내 친이란 세력의 정치적 태세와 치안 긴장에 간접 영향.</w:t>
+        <w:t xml:space="preserve">☞ 이란 관련 긴장이 이라크 내 친이란 세력의 정치적 메시지와 치안 경계에 영향을 미칠 가능성.</w:t>
       </w:r>
     </w:p>
     <w:p>
@@ -2381,7 +2039,7 @@
           <w:sz w:val="28"/>
           <w:szCs w:val="28"/>
         </w:rPr>
-        <w:t xml:space="preserve">- 7.7, 시리아, IS 및 국경 불안 지속.</w:t>
+        <w:t xml:space="preserve">- 7.8, 이스라엘·가자, 군사 충돌 지속.</w:t>
       </w:r>
     </w:p>
     <w:p>
@@ -2400,7 +2058,7 @@
           <w:sz w:val="28"/>
           <w:szCs w:val="28"/>
         </w:rPr>
-        <w:t xml:space="preserve">* 시리아 내 IS 관련 불안과 무장 충돌이 이어지며 이라크 국경 경계 강화 필요성 유지.</w:t>
+        <w:t xml:space="preserve">* 가자지구 관련 군사 충돌과 후티·이스라엘 간 긴장이 이어지며 중동 전반의 불확실성이 유지.</w:t>
       </w:r>
     </w:p>
     <w:p>
@@ -2419,7 +2077,7 @@
           <w:sz w:val="28"/>
           <w:szCs w:val="28"/>
         </w:rPr>
-        <w:t xml:space="preserve">* 이라크 정부는 시리아와의 안보 협력을 강조하며 국경 통제 강화를 지속.</w:t>
+        <w:t xml:space="preserve">* 이라크는 직접 전장 밖에 있으나, 역내 긴장 고조가 외교·안보 메시지 강화로 연결되는 양상.</w:t>
       </w:r>
     </w:p>
     <w:p>
@@ -2438,7 +2096,7 @@
           <w:sz w:val="28"/>
           <w:szCs w:val="28"/>
         </w:rPr>
-        <w:t xml:space="preserve">☞ 시리아발 불안이 이라크 서부·북부 치안 부담으로 연결될 가능성.</w:t>
+        <w:t xml:space="preserve">☞ 역내 분쟁 확산 시 이라크 내 반미·반이스라엘 정서와 시위 리스크가 재부각될 수 있음.</w:t>
       </w:r>
     </w:p>
     <w:p>
@@ -2457,7 +2115,7 @@
           <w:sz w:val="28"/>
           <w:szCs w:val="28"/>
         </w:rPr>
-        <w:t xml:space="preserve">- 7.7, 가자·후티, 역내 긴장 고조 지속.</w:t>
+        <w:t xml:space="preserve">- 7.6, 미군·이라크 관계, 주둔 및 협력 이슈 지속.</w:t>
       </w:r>
     </w:p>
     <w:p>
@@ -2476,7 +2134,7 @@
           <w:sz w:val="28"/>
           <w:szCs w:val="28"/>
         </w:rPr>
-        <w:t xml:space="preserve">* 가자지구와 후티 관련 군사 긴장이 이어지며 중동 전반의 불확실성 확대.</w:t>
+        <w:t xml:space="preserve">* 미군의 중동 재배치와 이라크 내 안보 협력 논의가 병행되며, 주둔·철수 이슈가 정치권 쟁점으로 잔존.</w:t>
       </w:r>
     </w:p>
     <w:p>
@@ -2495,7 +2153,7 @@
           <w:sz w:val="28"/>
           <w:szCs w:val="28"/>
         </w:rPr>
-        <w:t xml:space="preserve">* 이라크 직접 연루는 제한적이나, 역내 긴장 심화가 유가와 안보 심리에 영향.</w:t>
+        <w:t xml:space="preserve">* 이라크 정부는 주권과 안보 협력을 병행하는 입장을 유지하는 흐름.</w:t>
       </w:r>
     </w:p>
     <w:p>
@@ -2514,7 +2172,7 @@
           <w:sz w:val="28"/>
           <w:szCs w:val="28"/>
         </w:rPr>
-        <w:t xml:space="preserve">☞ 중동 전반 긴장 고조가 이라크 사업 환경의 외부 변수로 작용.</w:t>
+        <w:t xml:space="preserve">☞ 대외 안보 이슈가 국내 정치와 연결되며, 현장 외부활동 시 돌발 변수로 작용 가능.</w:t>
       </w:r>
     </w:p>
     <w:p>
@@ -2551,7 +2209,7 @@
           <w:sz w:val="28"/>
           <w:szCs w:val="28"/>
         </w:rPr>
-        <w:t xml:space="preserve">· 의회가 NIC와 투자 관련 기관을 집중 견제하면서 인허가·승인·대관 일정이 지연될 가능성이 커, 현장별 행정 대응을 선제적으로 점검할 필요.</w:t>
+        <w:t xml:space="preserve">· NIC·의회 심문이 반복되며 투자사업 승인과 행정 처리 속도 저하 가능성이 커져, 대외 협의 일정은 여유 있게 재조정할 필요.</w:t>
       </w:r>
     </w:p>
     <w:p>
@@ -2589,7 +2247,7 @@
           <w:sz w:val="28"/>
           <w:szCs w:val="28"/>
         </w:rPr>
-        <w:t xml:space="preserve">· 바그다드 시위와 IS·국경 리스크가 병존해 외부 업무, 이동경호, 현장 출입통제 기준을 상향 유지할 필요.</w:t>
+        <w:t xml:space="preserve">· 바그다드 및 현장 인근의 시위·안전사고·치안 경계가 병존하므로 외부 업무와 이동경호는 사전 위협평가 중심으로 운영 필요.</w:t>
       </w:r>
     </w:p>
     <w:p>

</xml_diff>